<commit_message>
Búsqueda de candidatas para la ruta del Marco Teórico (v1.48)
El proyecto de Lengua se reestructuró y la ruta fija al Marco Teórico dejó
de existir, tumbando comprobar_todo.py con un mensaje que parecía un error
de contenido en vez de un archivo movido. verificar_derivacion.py prueba
ahora varias rutas candidatas (más RUBRICAS_MARCO_TEORICO si se declara) y
busca por nombre en el repositorio hermano si ninguna acierta.

Co-Authored-By: Claude Sonnet 5 <noreply@anthropic.com>
</commit_message>
<xml_diff>
--- a/docs/Memoria_Registro_PI_Taller-de-Rubricas.docx
+++ b/docs/Memoria_Registro_PI_Taller-de-Rubricas.docx
@@ -859,7 +859,7 @@
                 <w:sz w:val="18"/>
                 <w:rFonts w:ascii="Palatino Linotype" w:hAnsi="Palatino Linotype" w:cs="Palatino Linotype"/>
               </w:rPr>
-              <w:t>13.153 líneas de código fuente propio y 31.325 líneas de contenido curricular estructurado</w:t>
+              <w:t>13.153 líneas de código fuente propio y 32.372 líneas de contenido curricular estructurado</w:t>
             </w:r>
           </w:p>
         </w:tc>
@@ -901,7 +901,7 @@
                 <w:sz w:val="18"/>
                 <w:rFonts w:ascii="Palatino Linotype" w:hAnsi="Palatino Linotype" w:cs="Palatino Linotype"/>
               </w:rPr>
-              <w:t>232 criterios de evaluación derivados, 928 descriptores y 189 matrices cuantitativas, en nueve tipos de tarea y seis cursos</w:t>
+              <w:t>249 criterios de evaluación derivados, 996 descriptores y 189 matrices cuantitativas, en diez tipos de tarea y seis cursos</w:t>
             </w:r>
           </w:p>
         </w:tc>
@@ -4688,7 +4688,7 @@
                 <w:sz w:val="18"/>
                 <w:rFonts w:ascii="Palatino Linotype" w:hAnsi="Palatino Linotype" w:cs="Palatino Linotype"/>
               </w:rPr>
-              <w:t>Archivos JSON versionados en el propio repositorio (31.325 líneas): packs de criterios, catálogo, tablas de derivación por materia, léxico de reglas, banco de verbos y esquema de pack.</w:t>
+              <w:t>Archivos JSON versionados en el propio repositorio (32.372 líneas): packs de criterios, catálogo, tablas de derivación por materia, léxico de reglas, banco de verbos y esquema de pack.</w:t>
             </w:r>
           </w:p>
         </w:tc>
@@ -5979,7 +5979,7 @@
                 <w:sz w:val="18"/>
                 <w:rFonts w:ascii="Palatino Linotype" w:hAnsi="Palatino Linotype" w:cs="Palatino Linotype"/>
               </w:rPr>
-              <w:t>31.325</w:t>
+              <w:t>32.372</w:t>
             </w:r>
           </w:p>
         </w:tc>
@@ -6043,7 +6043,7 @@
                 <w:sz w:val="18"/>
                 <w:rFonts w:ascii="Palatino Linotype" w:hAnsi="Palatino Linotype" w:cs="Palatino Linotype"/>
               </w:rPr>
-              <w:t>3.388</w:t>
+              <w:t>3.417</w:t>
             </w:r>
           </w:p>
         </w:tc>
@@ -6107,7 +6107,7 @@
                 <w:sz w:val="18"/>
                 <w:rFonts w:ascii="Palatino Linotype" w:hAnsi="Palatino Linotype" w:cs="Palatino Linotype"/>
               </w:rPr>
-              <w:t>5.604</w:t>
+              <w:t>5.916</w:t>
             </w:r>
           </w:p>
         </w:tc>
@@ -6171,7 +6171,7 @@
                 <w:sz w:val="18"/>
                 <w:rFonts w:ascii="Palatino Linotype" w:hAnsi="Palatino Linotype" w:cs="Palatino Linotype"/>
               </w:rPr>
-              <w:t>53.470</w:t>
+              <w:t>54.858</w:t>
             </w:r>
           </w:p>
         </w:tc>
@@ -6666,7 +6666,7 @@
           <w:sz w:val="21"/>
           <w:rFonts w:ascii="Palatino Linotype" w:hAnsi="Palatino Linotype" w:cs="Palatino Linotype"/>
         </w:rPr>
-        <w:t>El contenido curricular de la obra son 31.325 líneas de JSON de diseño propio, con su esquema normativo y su validador. Lo que sigue describe las estructuras originales que lo sostienen.</w:t>
+        <w:t>El contenido curricular de la obra son 32.372 líneas de JSON de diseño propio, con su esquema normativo y su validador. Lo que sigue describe las estructuras originales que lo sostienen.</w:t>
       </w:r>
     </w:p>
     <w:p>
@@ -6707,7 +6707,7 @@
           <w:sz w:val="21"/>
           <w:rFonts w:ascii="Palatino Linotype" w:hAnsi="Palatino Linotype" w:cs="Palatino Linotype"/>
         </w:rPr>
-        <w:t>nueve packs</w:t>
+        <w:t>diez packs</w:t>
       </w:r>
       <w:r>
         <w:rPr>
@@ -7078,7 +7078,7 @@
                 <w:sz w:val="18"/>
                 <w:rFonts w:ascii="Palatino Linotype" w:hAnsi="Palatino Linotype" w:cs="Palatino Linotype"/>
               </w:rPr>
-              <w:t>Texto expositivo</w:t>
+              <w:t>Debate y situaciones orales dialogadas</w:t>
             </w:r>
           </w:p>
         </w:tc>
@@ -7098,7 +7098,7 @@
                 <w:sz w:val="18"/>
                 <w:rFonts w:ascii="Palatino Linotype" w:hAnsi="Palatino Linotype" w:cs="Palatino Linotype"/>
               </w:rPr>
-              <w:t>pack-lcl-expositivo.json</w:t>
+              <w:t>pack-lcl-debate.json</w:t>
             </w:r>
           </w:p>
         </w:tc>
@@ -7119,7 +7119,7 @@
                 <w:sz w:val="18"/>
                 <w:rFonts w:ascii="Palatino Linotype" w:hAnsi="Palatino Linotype" w:cs="Palatino Linotype"/>
               </w:rPr>
-              <w:t>0.2.0</w:t>
+              <w:t>0.1.0</w:t>
             </w:r>
           </w:p>
         </w:tc>
@@ -7140,7 +7140,7 @@
                 <w:sz w:val="18"/>
                 <w:rFonts w:ascii="Palatino Linotype" w:hAnsi="Palatino Linotype" w:cs="Palatino Linotype"/>
               </w:rPr>
-              <w:t>36</w:t>
+              <w:t>11</w:t>
             </w:r>
           </w:p>
         </w:tc>
@@ -7161,7 +7161,7 @@
                 <w:sz w:val="18"/>
                 <w:rFonts w:ascii="Palatino Linotype" w:hAnsi="Palatino Linotype" w:cs="Palatino Linotype"/>
               </w:rPr>
-              <w:t>6</w:t>
+              <w:t>3</w:t>
             </w:r>
           </w:p>
         </w:tc>
@@ -7183,7 +7183,7 @@
                 <w:sz w:val="18"/>
                 <w:rFonts w:ascii="Palatino Linotype" w:hAnsi="Palatino Linotype" w:cs="Palatino Linotype"/>
               </w:rPr>
-              <w:t>Trabajo de investigación multimodal</w:t>
+              <w:t>Texto expositivo</w:t>
             </w:r>
           </w:p>
         </w:tc>
@@ -7203,7 +7203,7 @@
                 <w:sz w:val="18"/>
                 <w:rFonts w:ascii="Palatino Linotype" w:hAnsi="Palatino Linotype" w:cs="Palatino Linotype"/>
               </w:rPr>
-              <w:t>pack-lcl-investigacion.json</w:t>
+              <w:t>pack-lcl-expositivo.json</w:t>
             </w:r>
           </w:p>
         </w:tc>
@@ -7245,7 +7245,7 @@
                 <w:sz w:val="18"/>
                 <w:rFonts w:ascii="Palatino Linotype" w:hAnsi="Palatino Linotype" w:cs="Palatino Linotype"/>
               </w:rPr>
-              <w:t>27</w:t>
+              <w:t>36</w:t>
             </w:r>
           </w:p>
         </w:tc>
@@ -7266,7 +7266,7 @@
                 <w:sz w:val="18"/>
                 <w:rFonts w:ascii="Palatino Linotype" w:hAnsi="Palatino Linotype" w:cs="Palatino Linotype"/>
               </w:rPr>
-              <w:t>5</w:t>
+              <w:t>6</w:t>
             </w:r>
           </w:p>
         </w:tc>
@@ -7288,7 +7288,7 @@
                 <w:sz w:val="18"/>
                 <w:rFonts w:ascii="Palatino Linotype" w:hAnsi="Palatino Linotype" w:cs="Palatino Linotype"/>
               </w:rPr>
-              <w:t>Narración</w:t>
+              <w:t>Trabajo de investigación multimodal</w:t>
             </w:r>
           </w:p>
         </w:tc>
@@ -7308,7 +7308,7 @@
                 <w:sz w:val="18"/>
                 <w:rFonts w:ascii="Palatino Linotype" w:hAnsi="Palatino Linotype" w:cs="Palatino Linotype"/>
               </w:rPr>
-              <w:t>pack-lcl-narracion.json</w:t>
+              <w:t>pack-lcl-investigacion.json</w:t>
             </w:r>
           </w:p>
         </w:tc>
@@ -7350,7 +7350,7 @@
                 <w:sz w:val="18"/>
                 <w:rFonts w:ascii="Palatino Linotype" w:hAnsi="Palatino Linotype" w:cs="Palatino Linotype"/>
               </w:rPr>
-              <w:t>18</w:t>
+              <w:t>27</w:t>
             </w:r>
           </w:p>
         </w:tc>
@@ -7371,7 +7371,7 @@
                 <w:sz w:val="18"/>
                 <w:rFonts w:ascii="Palatino Linotype" w:hAnsi="Palatino Linotype" w:cs="Palatino Linotype"/>
               </w:rPr>
-              <w:t>3</w:t>
+              <w:t>5</w:t>
             </w:r>
           </w:p>
         </w:tc>
@@ -7393,7 +7393,7 @@
                 <w:sz w:val="18"/>
                 <w:rFonts w:ascii="Palatino Linotype" w:hAnsi="Palatino Linotype" w:cs="Palatino Linotype"/>
               </w:rPr>
-              <w:t>Redacción de una noticia</w:t>
+              <w:t>Narración</w:t>
             </w:r>
           </w:p>
         </w:tc>
@@ -7413,7 +7413,7 @@
                 <w:sz w:val="18"/>
                 <w:rFonts w:ascii="Palatino Linotype" w:hAnsi="Palatino Linotype" w:cs="Palatino Linotype"/>
               </w:rPr>
-              <w:t>pack-lcl-noticia.json</w:t>
+              <w:t>pack-lcl-narracion.json</w:t>
             </w:r>
           </w:p>
         </w:tc>
@@ -7434,7 +7434,7 @@
                 <w:sz w:val="18"/>
                 <w:rFonts w:ascii="Palatino Linotype" w:hAnsi="Palatino Linotype" w:cs="Palatino Linotype"/>
               </w:rPr>
-              <w:t>0.1.0</w:t>
+              <w:t>0.2.0</w:t>
             </w:r>
           </w:p>
         </w:tc>
@@ -7455,7 +7455,7 @@
                 <w:sz w:val="18"/>
                 <w:rFonts w:ascii="Palatino Linotype" w:hAnsi="Palatino Linotype" w:cs="Palatino Linotype"/>
               </w:rPr>
-              <w:t>24</w:t>
+              <w:t>18</w:t>
             </w:r>
           </w:p>
         </w:tc>
@@ -7476,7 +7476,7 @@
                 <w:sz w:val="18"/>
                 <w:rFonts w:ascii="Palatino Linotype" w:hAnsi="Palatino Linotype" w:cs="Palatino Linotype"/>
               </w:rPr>
-              <w:t>5</w:t>
+              <w:t>3</w:t>
             </w:r>
           </w:p>
         </w:tc>
@@ -7498,7 +7498,7 @@
                 <w:sz w:val="18"/>
                 <w:rFonts w:ascii="Palatino Linotype" w:hAnsi="Palatino Linotype" w:cs="Palatino Linotype"/>
               </w:rPr>
-              <w:t>Exposición oral</w:t>
+              <w:t>Redacción de una noticia</w:t>
             </w:r>
           </w:p>
         </w:tc>
@@ -7518,7 +7518,7 @@
                 <w:sz w:val="18"/>
                 <w:rFonts w:ascii="Palatino Linotype" w:hAnsi="Palatino Linotype" w:cs="Palatino Linotype"/>
               </w:rPr>
-              <w:t>pack-lcl-oral.json</w:t>
+              <w:t>pack-lcl-noticia.json</w:t>
             </w:r>
           </w:p>
         </w:tc>
@@ -7539,7 +7539,7 @@
                 <w:sz w:val="18"/>
                 <w:rFonts w:ascii="Palatino Linotype" w:hAnsi="Palatino Linotype" w:cs="Palatino Linotype"/>
               </w:rPr>
-              <w:t>0.3.0</w:t>
+              <w:t>0.1.0</w:t>
             </w:r>
           </w:p>
         </w:tc>
@@ -7560,7 +7560,7 @@
                 <w:sz w:val="18"/>
                 <w:rFonts w:ascii="Palatino Linotype" w:hAnsi="Palatino Linotype" w:cs="Palatino Linotype"/>
               </w:rPr>
-              <w:t>30</w:t>
+              <w:t>24</w:t>
             </w:r>
           </w:p>
         </w:tc>
@@ -7581,7 +7581,7 @@
                 <w:sz w:val="18"/>
                 <w:rFonts w:ascii="Palatino Linotype" w:hAnsi="Palatino Linotype" w:cs="Palatino Linotype"/>
               </w:rPr>
-              <w:t>6</w:t>
+              <w:t>5</w:t>
             </w:r>
           </w:p>
         </w:tc>
@@ -7603,7 +7603,7 @@
                 <w:sz w:val="18"/>
                 <w:rFonts w:ascii="Palatino Linotype" w:hAnsi="Palatino Linotype" w:cs="Palatino Linotype"/>
               </w:rPr>
-              <w:t>Reacción a una noticia</w:t>
+              <w:t>Exposición oral</w:t>
             </w:r>
           </w:p>
         </w:tc>
@@ -7623,7 +7623,7 @@
                 <w:sz w:val="18"/>
                 <w:rFonts w:ascii="Palatino Linotype" w:hAnsi="Palatino Linotype" w:cs="Palatino Linotype"/>
               </w:rPr>
-              <w:t>pack-lcl-reaccion.json</w:t>
+              <w:t>pack-lcl-oral.json</w:t>
             </w:r>
           </w:p>
         </w:tc>
@@ -7644,7 +7644,7 @@
                 <w:sz w:val="18"/>
                 <w:rFonts w:ascii="Palatino Linotype" w:hAnsi="Palatino Linotype" w:cs="Palatino Linotype"/>
               </w:rPr>
-              <w:t>0.1.0</w:t>
+              <w:t>0.4.0</w:t>
             </w:r>
           </w:p>
         </w:tc>
@@ -7665,7 +7665,7 @@
                 <w:sz w:val="18"/>
                 <w:rFonts w:ascii="Palatino Linotype" w:hAnsi="Palatino Linotype" w:cs="Palatino Linotype"/>
               </w:rPr>
-              <w:t>18</w:t>
+              <w:t>36</w:t>
             </w:r>
           </w:p>
         </w:tc>
@@ -7686,7 +7686,7 @@
                 <w:sz w:val="18"/>
                 <w:rFonts w:ascii="Palatino Linotype" w:hAnsi="Palatino Linotype" w:cs="Palatino Linotype"/>
               </w:rPr>
-              <w:t>4</w:t>
+              <w:t>6</w:t>
             </w:r>
           </w:p>
         </w:tc>
@@ -7708,7 +7708,7 @@
                 <w:sz w:val="18"/>
                 <w:rFonts w:ascii="Palatino Linotype" w:hAnsi="Palatino Linotype" w:cs="Palatino Linotype"/>
               </w:rPr>
-              <w:t>Resumen de un texto</w:t>
+              <w:t>Reacción a una noticia</w:t>
             </w:r>
           </w:p>
         </w:tc>
@@ -7728,7 +7728,7 @@
                 <w:sz w:val="18"/>
                 <w:rFonts w:ascii="Palatino Linotype" w:hAnsi="Palatino Linotype" w:cs="Palatino Linotype"/>
               </w:rPr>
-              <w:t>pack-lcl-resumen.json</w:t>
+              <w:t>pack-lcl-reaccion.json</w:t>
             </w:r>
           </w:p>
         </w:tc>
@@ -7770,7 +7770,7 @@
                 <w:sz w:val="18"/>
                 <w:rFonts w:ascii="Palatino Linotype" w:hAnsi="Palatino Linotype" w:cs="Palatino Linotype"/>
               </w:rPr>
-              <w:t>20</w:t>
+              <w:t>18</w:t>
             </w:r>
           </w:p>
         </w:tc>
@@ -7807,6 +7807,111 @@
             </w:pPr>
             <w:r>
               <w:rPr>
+                <w:b w:val="0"/>
+                <w:i w:val="0"/>
+                <w:color w:val="1C1F26"/>
+                <w:sz w:val="18"/>
+                <w:rFonts w:ascii="Palatino Linotype" w:hAnsi="Palatino Linotype" w:cs="Palatino Linotype"/>
+              </w:rPr>
+              <w:t>Resumen de un texto</w:t>
+            </w:r>
+          </w:p>
+        </w:tc>
+        <w:tc>
+          <w:tcPr>
+            <w:tcW w:type="dxa" w:w="3402"/>
+          </w:tcPr>
+          <w:p>
+            <w:pPr>
+              <w:spacing w:before="60" w:after="60"/>
+            </w:pPr>
+            <w:r>
+              <w:rPr>
+                <w:b w:val="0"/>
+                <w:i w:val="0"/>
+                <w:color w:val="1C1F26"/>
+                <w:sz w:val="18"/>
+                <w:rFonts w:ascii="Palatino Linotype" w:hAnsi="Palatino Linotype" w:cs="Palatino Linotype"/>
+              </w:rPr>
+              <w:t>pack-lcl-resumen.json</w:t>
+            </w:r>
+          </w:p>
+        </w:tc>
+        <w:tc>
+          <w:tcPr>
+            <w:tcW w:type="dxa" w:w="1020"/>
+          </w:tcPr>
+          <w:p>
+            <w:pPr>
+              <w:spacing w:before="60" w:after="60"/>
+              <w:jc w:val="center"/>
+            </w:pPr>
+            <w:r>
+              <w:rPr>
+                <w:b w:val="0"/>
+                <w:i w:val="0"/>
+                <w:color w:val="1C1F26"/>
+                <w:sz w:val="18"/>
+                <w:rFonts w:ascii="Palatino Linotype" w:hAnsi="Palatino Linotype" w:cs="Palatino Linotype"/>
+              </w:rPr>
+              <w:t>0.1.0</w:t>
+            </w:r>
+          </w:p>
+        </w:tc>
+        <w:tc>
+          <w:tcPr>
+            <w:tcW w:type="dxa" w:w="1247"/>
+          </w:tcPr>
+          <w:p>
+            <w:pPr>
+              <w:spacing w:before="60" w:after="60"/>
+              <w:jc w:val="center"/>
+            </w:pPr>
+            <w:r>
+              <w:rPr>
+                <w:b w:val="0"/>
+                <w:i w:val="0"/>
+                <w:color w:val="1C1F26"/>
+                <w:sz w:val="18"/>
+                <w:rFonts w:ascii="Palatino Linotype" w:hAnsi="Palatino Linotype" w:cs="Palatino Linotype"/>
+              </w:rPr>
+              <w:t>20</w:t>
+            </w:r>
+          </w:p>
+        </w:tc>
+        <w:tc>
+          <w:tcPr>
+            <w:tcW w:type="dxa" w:w="1247"/>
+          </w:tcPr>
+          <w:p>
+            <w:pPr>
+              <w:spacing w:before="60" w:after="60"/>
+              <w:jc w:val="center"/>
+            </w:pPr>
+            <w:r>
+              <w:rPr>
+                <w:b w:val="0"/>
+                <w:i w:val="0"/>
+                <w:color w:val="1C1F26"/>
+                <w:sz w:val="18"/>
+                <w:rFonts w:ascii="Palatino Linotype" w:hAnsi="Palatino Linotype" w:cs="Palatino Linotype"/>
+              </w:rPr>
+              <w:t>4</w:t>
+            </w:r>
+          </w:p>
+        </w:tc>
+      </w:tr>
+      <w:tr>
+        <w:tc>
+          <w:tcPr>
+            <w:tcW w:type="dxa" w:w="2494"/>
+          </w:tcPr>
+          <w:p>
+            <w:pPr>
+              <w:spacing w:before="60" w:after="60"/>
+            </w:pPr>
+            <w:r>
+              <w:rPr>
                 <w:b/>
                 <w:i w:val="0"/>
                 <w:color w:val="1C1F26"/>
@@ -7855,7 +7960,7 @@
                 <w:sz w:val="18"/>
                 <w:rFonts w:ascii="Palatino Linotype" w:hAnsi="Palatino Linotype" w:cs="Palatino Linotype"/>
               </w:rPr>
-              <w:t>232</w:t>
+              <w:t>249</w:t>
             </w:r>
           </w:p>
         </w:tc>
@@ -8537,7 +8642,7 @@
           <w:sz w:val="21"/>
           <w:rFonts w:ascii="Palatino Linotype" w:hAnsi="Palatino Linotype" w:cs="Palatino Linotype"/>
         </w:rPr>
-        <w:t>928 descriptores</w:t>
+        <w:t>996 descriptores</w:t>
       </w:r>
       <w:r>
         <w:rPr>
@@ -8557,7 +8662,7 @@
           <w:sz w:val="21"/>
           <w:rFonts w:ascii="Palatino Linotype" w:hAnsi="Palatino Linotype" w:cs="Palatino Linotype"/>
         </w:rPr>
-        <w:t>62 dimensiones distintas</w:t>
+        <w:t>67 dimensiones distintas</w:t>
       </w:r>
       <w:r>
         <w:rPr>
@@ -8577,7 +8682,7 @@
           <w:sz w:val="21"/>
           <w:rFonts w:ascii="Palatino Linotype" w:hAnsi="Palatino Linotype" w:cs="Palatino Linotype"/>
         </w:rPr>
-        <w:t>49 pares de criterio oficial y curso</w:t>
+        <w:t>55 pares de criterio oficial y curso</w:t>
       </w:r>
       <w:r>
         <w:rPr>
@@ -8766,7 +8871,7 @@
                 <w:sz w:val="18"/>
                 <w:rFonts w:ascii="Palatino Linotype" w:hAnsi="Palatino Linotype" w:cs="Palatino Linotype"/>
               </w:rPr>
-              <w:t>sobre 232 criterios</w:t>
+              <w:t>sobre 249 criterios</w:t>
             </w:r>
           </w:p>
         </w:tc>
@@ -9127,7 +9232,7 @@
           <w:sz w:val="21"/>
           <w:rFonts w:ascii="Palatino Linotype" w:hAnsi="Palatino Linotype" w:cs="Palatino Linotype"/>
         </w:rPr>
-        <w:t>43 celdas</w:t>
+        <w:t>46 celdas</w:t>
       </w:r>
       <w:r>
         <w:rPr>
@@ -9137,7 +9242,7 @@
           <w:sz w:val="21"/>
           <w:rFonts w:ascii="Palatino Linotype" w:hAnsi="Palatino Linotype" w:cs="Palatino Linotype"/>
         </w:rPr>
-        <w:t xml:space="preserve"> sobre las 54 combinaciones posibles de nueve tipos de tarea y seis cursos:</w:t>
+        <w:t xml:space="preserve"> sobre las 60 combinaciones posibles de diez tipos de tarea y seis cursos:</w:t>
       </w:r>
     </w:p>
     <w:tbl>
@@ -9779,6 +9884,154 @@
                 <w:sz w:val="18"/>
                 <w:rFonts w:ascii="Palatino Linotype" w:hAnsi="Palatino Linotype" w:cs="Palatino Linotype"/>
               </w:rPr>
+              <w:t>Debate y situaciones orales dialogadas</w:t>
+            </w:r>
+          </w:p>
+        </w:tc>
+        <w:tc>
+          <w:tcPr>
+            <w:tcW w:type="dxa" w:w="1077"/>
+          </w:tcPr>
+          <w:p>
+            <w:pPr>
+              <w:spacing w:before="60" w:after="60"/>
+              <w:jc w:val="center"/>
+            </w:pPr>
+            <w:r>
+              <w:rPr>
+                <w:b w:val="0"/>
+                <w:i w:val="0"/>
+                <w:color w:val="1C1F26"/>
+                <w:sz w:val="18"/>
+                <w:rFonts w:ascii="Palatino Linotype" w:hAnsi="Palatino Linotype" w:cs="Palatino Linotype"/>
+              </w:rPr>
+              <w:t>●</w:t>
+            </w:r>
+          </w:p>
+        </w:tc>
+        <w:tc>
+          <w:tcPr>
+            <w:tcW w:type="dxa" w:w="1077"/>
+          </w:tcPr>
+          <w:p>
+            <w:pPr>
+              <w:spacing w:before="60" w:after="60"/>
+              <w:jc w:val="center"/>
+            </w:pPr>
+            <w:r>
+              <w:rPr>
+                <w:b w:val="0"/>
+                <w:i w:val="0"/>
+                <w:color w:val="1C1F26"/>
+                <w:sz w:val="18"/>
+                <w:rFonts w:ascii="Palatino Linotype" w:hAnsi="Palatino Linotype" w:cs="Palatino Linotype"/>
+              </w:rPr>
+              <w:t>●</w:t>
+            </w:r>
+          </w:p>
+        </w:tc>
+        <w:tc>
+          <w:tcPr>
+            <w:tcW w:type="dxa" w:w="1077"/>
+          </w:tcPr>
+          <w:p>
+            <w:pPr>
+              <w:spacing w:before="60" w:after="60"/>
+              <w:jc w:val="center"/>
+            </w:pPr>
+            <w:r>
+              <w:rPr>
+                <w:b w:val="0"/>
+                <w:i w:val="0"/>
+                <w:color w:val="1C1F26"/>
+                <w:sz w:val="18"/>
+                <w:rFonts w:ascii="Palatino Linotype" w:hAnsi="Palatino Linotype" w:cs="Palatino Linotype"/>
+              </w:rPr>
+              <w:t>·</w:t>
+            </w:r>
+          </w:p>
+        </w:tc>
+        <w:tc>
+          <w:tcPr>
+            <w:tcW w:type="dxa" w:w="1077"/>
+          </w:tcPr>
+          <w:p>
+            <w:pPr>
+              <w:spacing w:before="60" w:after="60"/>
+              <w:jc w:val="center"/>
+            </w:pPr>
+            <w:r>
+              <w:rPr>
+                <w:b w:val="0"/>
+                <w:i w:val="0"/>
+                <w:color w:val="1C1F26"/>
+                <w:sz w:val="18"/>
+                <w:rFonts w:ascii="Palatino Linotype" w:hAnsi="Palatino Linotype" w:cs="Palatino Linotype"/>
+              </w:rPr>
+              <w:t>●</w:t>
+            </w:r>
+          </w:p>
+        </w:tc>
+        <w:tc>
+          <w:tcPr>
+            <w:tcW w:type="dxa" w:w="1077"/>
+          </w:tcPr>
+          <w:p>
+            <w:pPr>
+              <w:spacing w:before="60" w:after="60"/>
+              <w:jc w:val="center"/>
+            </w:pPr>
+            <w:r>
+              <w:rPr>
+                <w:b w:val="0"/>
+                <w:i w:val="0"/>
+                <w:color w:val="1C1F26"/>
+                <w:sz w:val="18"/>
+                <w:rFonts w:ascii="Palatino Linotype" w:hAnsi="Palatino Linotype" w:cs="Palatino Linotype"/>
+              </w:rPr>
+              <w:t>·</w:t>
+            </w:r>
+          </w:p>
+        </w:tc>
+        <w:tc>
+          <w:tcPr>
+            <w:tcW w:type="dxa" w:w="1077"/>
+          </w:tcPr>
+          <w:p>
+            <w:pPr>
+              <w:spacing w:before="60" w:after="60"/>
+              <w:jc w:val="center"/>
+            </w:pPr>
+            <w:r>
+              <w:rPr>
+                <w:b w:val="0"/>
+                <w:i w:val="0"/>
+                <w:color w:val="1C1F26"/>
+                <w:sz w:val="18"/>
+                <w:rFonts w:ascii="Palatino Linotype" w:hAnsi="Palatino Linotype" w:cs="Palatino Linotype"/>
+              </w:rPr>
+              <w:t>·</w:t>
+            </w:r>
+          </w:p>
+        </w:tc>
+      </w:tr>
+      <w:tr>
+        <w:tc>
+          <w:tcPr>
+            <w:tcW w:type="dxa" w:w="2948"/>
+          </w:tcPr>
+          <w:p>
+            <w:pPr>
+              <w:spacing w:before="60" w:after="60"/>
+            </w:pPr>
+            <w:r>
+              <w:rPr>
+                <w:b w:val="0"/>
+                <w:i w:val="0"/>
+                <w:color w:val="1C1F26"/>
+                <w:sz w:val="18"/>
+                <w:rFonts w:ascii="Palatino Linotype" w:hAnsi="Palatino Linotype" w:cs="Palatino Linotype"/>
+              </w:rPr>
               <w:t>Texto argumentativo</w:t>
             </w:r>
           </w:p>
@@ -12628,7 +12881,7 @@
                 <w:sz w:val="18"/>
                 <w:rFonts w:ascii="Palatino Linotype" w:hAnsi="Palatino Linotype" w:cs="Palatino Linotype"/>
               </w:rPr>
-              <w:t>232 criterios de evaluación en nueve tipos de tarea y seis cursos, cada uno con su cita literal del decreto, su vehículo de saberes y su posición en los tres ejes de progresión.</w:t>
+              <w:t>249 criterios de evaluación en diez tipos de tarea y seis cursos, cada uno con su cita literal del decreto, su vehículo de saberes y su posición en los tres ejes de progresión.</w:t>
             </w:r>
           </w:p>
         </w:tc>
@@ -12670,7 +12923,7 @@
                 <w:sz w:val="18"/>
                 <w:rFonts w:ascii="Palatino Linotype" w:hAnsi="Palatino Linotype" w:cs="Palatino Linotype"/>
               </w:rPr>
-              <w:t>928 descriptores redactados con la fórmula propia «verbo del banco + objeto o saber-vehículo + condición o finalidad comunicativa», en 62 dimensiones distintas y sin calificadores vagos.</w:t>
+              <w:t>996 descriptores redactados con la fórmula propia «verbo del banco + objeto o saber-vehículo + condición o finalidad comunicativa», en 67 dimensiones distintas y sin calificadores vagos.</w:t>
             </w:r>
           </w:p>
         </w:tc>
@@ -12754,7 +13007,7 @@
                 <w:sz w:val="18"/>
                 <w:rFonts w:ascii="Palatino Linotype" w:hAnsi="Palatino Linotype" w:cs="Palatino Linotype"/>
               </w:rPr>
-              <w:t>La matriz de qué tarea sostiene el currículo en qué curso (43 celdas justificadas una a una) y el techo de progresión por curso y eje.</w:t>
+              <w:t>La matriz de qué tarea sostiene el currículo en qué curso (46 celdas justificadas una a una) y el techo de progresión por curso y eje.</w:t>
             </w:r>
           </w:p>
         </w:tc>
@@ -13371,7 +13624,7 @@
                 <w:sz w:val="18"/>
                 <w:rFonts w:ascii="Palatino Linotype" w:hAnsi="Palatino Linotype" w:cs="Palatino Linotype"/>
               </w:rPr>
-              <w:t>31.325 líneas de JSON: nueve packs de criterios, catálogo, tablas de derivación, léxico de reglas, banco de verbos y esquema.</w:t>
+              <w:t>32.372 líneas de JSON: diez packs de criterios, catálogo, tablas de derivación, léxico de reglas, banco de verbos y esquema.</w:t>
             </w:r>
           </w:p>
         </w:tc>
@@ -13413,7 +13666,7 @@
                 <w:sz w:val="18"/>
                 <w:rFonts w:ascii="Palatino Linotype" w:hAnsi="Palatino Linotype" w:cs="Palatino Linotype"/>
               </w:rPr>
-              <w:t>3.388 líneas: documento de diseño de software, registro razonado de cambios, motivos de cada regla, guía para añadir una materia y análisis de enlace con los proyectos afines del autor.</w:t>
+              <w:t>3.417 líneas: documento de diseño de software, registro razonado de cambios, motivos de cada regla, guía para añadir una materia y análisis de enlace con los proyectos afines del autor.</w:t>
             </w:r>
           </w:p>
         </w:tc>
@@ -14888,7 +15141,7 @@
           <w:sz w:val="21"/>
           <w:rFonts w:ascii="Palatino Linotype" w:hAnsi="Palatino Linotype" w:cs="Palatino Linotype"/>
         </w:rPr>
-        <w:t>`pack-lcl-expositivo.json` — texto expositivo: 36 criterios en seis cursos.</w:t>
+        <w:t>`pack-lcl-debate.json` — debate y situaciones orales dialogadas: 11 criterios en tres cursos.</w:t>
       </w:r>
     </w:p>
     <w:p>
@@ -14905,7 +15158,7 @@
           <w:sz w:val="21"/>
           <w:rFonts w:ascii="Palatino Linotype" w:hAnsi="Palatino Linotype" w:cs="Palatino Linotype"/>
         </w:rPr>
-        <w:t>`pack-lcl-investigacion.json` — trabajo de investigación multimodal: 27 criterios en cinco cursos.</w:t>
+        <w:t>`pack-lcl-expositivo.json` — texto expositivo: 36 criterios en seis cursos.</w:t>
       </w:r>
     </w:p>
     <w:p>
@@ -14922,7 +15175,7 @@
           <w:sz w:val="21"/>
           <w:rFonts w:ascii="Palatino Linotype" w:hAnsi="Palatino Linotype" w:cs="Palatino Linotype"/>
         </w:rPr>
-        <w:t>`pack-lcl-narracion.json` — narración: 18 criterios en tres cursos.</w:t>
+        <w:t>`pack-lcl-investigacion.json` — trabajo de investigación multimodal: 27 criterios en cinco cursos.</w:t>
       </w:r>
     </w:p>
     <w:p>
@@ -14939,7 +15192,7 @@
           <w:sz w:val="21"/>
           <w:rFonts w:ascii="Palatino Linotype" w:hAnsi="Palatino Linotype" w:cs="Palatino Linotype"/>
         </w:rPr>
-        <w:t>`pack-lcl-noticia.json` — redacción de una noticia: 24 criterios en cinco cursos.</w:t>
+        <w:t>`pack-lcl-narracion.json` — narración: 18 criterios en tres cursos.</w:t>
       </w:r>
     </w:p>
     <w:p>
@@ -14956,7 +15209,24 @@
           <w:sz w:val="21"/>
           <w:rFonts w:ascii="Palatino Linotype" w:hAnsi="Palatino Linotype" w:cs="Palatino Linotype"/>
         </w:rPr>
-        <w:t>`pack-lcl-oral.json` — exposición oral: 30 criterios en seis cursos.</w:t>
+        <w:t>`pack-lcl-noticia.json` — redacción de una noticia: 24 criterios en cinco cursos.</w:t>
+      </w:r>
+    </w:p>
+    <w:p>
+      <w:pPr>
+        <w:pStyle w:val="ListBullet"/>
+        <w:spacing w:after="60"/>
+        <w:jc w:val="both"/>
+      </w:pPr>
+      <w:r>
+        <w:rPr>
+          <w:b w:val="0"/>
+          <w:i w:val="0"/>
+          <w:color w:val="1C1F26"/>
+          <w:sz w:val="21"/>
+          <w:rFonts w:ascii="Palatino Linotype" w:hAnsi="Palatino Linotype" w:cs="Palatino Linotype"/>
+        </w:rPr>
+        <w:t>`pack-lcl-oral.json` — exposición oral: 36 criterios en seis cursos.</w:t>
       </w:r>
     </w:p>
     <w:p>

</xml_diff>

<commit_message>
Condición de evidencia: campo de dimensión en pack (v1.49-v1.50)
Añade `condicion_de_evidencia` para lo que la tarea tiene que montar
antes de poder puntuar una fila (turno de preguntas, réplica del
debate, soporte de pantallas de investigación). Regla en los dos
validadores: declararla en unos cursos de la dimensión y no en otros
es error. Se imprime solo en la rúbrica analítica, nunca en la ficha
del alumno.

Co-Authored-By: Claude Sonnet 5 <noreply@anthropic.com>
</commit_message>
<xml_diff>
--- a/docs/Memoria_Registro_PI_Taller-de-Rubricas.docx
+++ b/docs/Memoria_Registro_PI_Taller-de-Rubricas.docx
@@ -859,7 +859,7 @@
                 <w:sz w:val="18"/>
                 <w:rFonts w:ascii="Palatino Linotype" w:hAnsi="Palatino Linotype" w:cs="Palatino Linotype"/>
               </w:rPr>
-              <w:t>13.153 líneas de código fuente propio y 32.372 líneas de contenido curricular estructurado</w:t>
+              <w:t>13.380 líneas de código fuente propio y 32.379 líneas de contenido curricular estructurado</w:t>
             </w:r>
           </w:p>
         </w:tc>
@@ -1412,7 +1412,7 @@
           <w:sz w:val="21"/>
           <w:rFonts w:ascii="Palatino Linotype" w:hAnsi="Palatino Linotype" w:cs="Palatino Linotype"/>
         </w:rPr>
-        <w:t xml:space="preserve"> El objetivo del proyecto no es que existan más rúbricas, sino que profesores y alumnos sepan usarlas. La aplicación incorpora un validador de calidad de descriptores con veintiuna reglas y veinticinco microexplicaciones desplegables situadas en el punto exacto en que el profesor toma cada decisión. El validador no se limita a marcar el fallo: explica la regla que lo sostiene.</w:t>
+        <w:t xml:space="preserve"> El objetivo del proyecto no es que existan más rúbricas, sino que profesores y alumnos sepan usarlas. La aplicación incorpora un validador de calidad de descriptores con veintidós reglas y veinticinco microexplicaciones desplegables situadas en el punto exacto en que el profesor toma cada decisión. El validador no se limita a marcar el fallo: explica la regla que lo sostiene.</w:t>
       </w:r>
     </w:p>
     <w:p>
@@ -3026,7 +3026,7 @@
           <w:sz w:val="21"/>
           <w:rFonts w:ascii="Palatino Linotype" w:hAnsi="Palatino Linotype" w:cs="Palatino Linotype"/>
         </w:rPr>
-        <w:t>veintiuna reglas</w:t>
+        <w:t>veintidós reglas</w:t>
       </w:r>
       <w:r>
         <w:rPr>
@@ -4646,7 +4646,7 @@
                 <w:sz w:val="18"/>
                 <w:rFonts w:ascii="Palatino Linotype" w:hAnsi="Palatino Linotype" w:cs="Palatino Linotype"/>
               </w:rPr>
-              <w:t>JavaScript con módulos ES nativos (3.735 líneas): motor de generación, modelo de calificación, validador de calidad, catálogo de microexplicaciones, modo avanzado, pantalla de calificar y exportadores.</w:t>
+              <w:t>JavaScript con módulos ES nativos (3.793 líneas): motor de generación, modelo de calificación, validador de calidad, catálogo de microexplicaciones, modo avanzado, pantalla de calificar y exportadores.</w:t>
             </w:r>
           </w:p>
         </w:tc>
@@ -4688,7 +4688,7 @@
                 <w:sz w:val="18"/>
                 <w:rFonts w:ascii="Palatino Linotype" w:hAnsi="Palatino Linotype" w:cs="Palatino Linotype"/>
               </w:rPr>
-              <w:t>Archivos JSON versionados en el propio repositorio (32.372 líneas): packs de criterios, catálogo, tablas de derivación por materia, léxico de reglas, banco de verbos y esquema de pack.</w:t>
+              <w:t>Archivos JSON versionados en el propio repositorio (32.379 líneas): packs de criterios, catálogo, tablas de derivación por materia, léxico de reglas, banco de verbos y esquema de pack.</w:t>
             </w:r>
           </w:p>
         </w:tc>
@@ -4730,7 +4730,7 @@
                 <w:sz w:val="18"/>
                 <w:rFonts w:ascii="Palatino Linotype" w:hAnsi="Palatino Linotype" w:cs="Palatino Linotype"/>
               </w:rPr>
-              <w:t>Programas en Python (6.292 líneas) que construyen los derivados, validan el contenido y verifican mecánicamente la derivación normativa. No forman parte de lo que se sirve al navegador, pero sí de la obra.</w:t>
+              <w:t>Programas en Python (6.371 líneas) que construyen los derivados, validan el contenido y verifican mecánicamente la derivación normativa. No forman parte de lo que se sirve al navegador, pero sí de la obra.</w:t>
             </w:r>
           </w:p>
         </w:tc>
@@ -4772,7 +4772,7 @@
                 <w:sz w:val="18"/>
                 <w:rFonts w:ascii="Palatino Linotype" w:hAnsi="Palatino Linotype" w:cs="Palatino Linotype"/>
               </w:rPr>
-              <w:t>Casos dorados en Node sin dependencias (1.849 líneas): validador, premarcado, proyección a primera persona y modelo de calificación.</w:t>
+              <w:t>Casos dorados en Node sin dependencias (1.927 líneas): validador, premarcado, proyección a primera persona y modelo de calificación.</w:t>
             </w:r>
           </w:p>
         </w:tc>
@@ -5659,7 +5659,7 @@
                 <w:sz w:val="18"/>
                 <w:rFonts w:ascii="Palatino Linotype" w:hAnsi="Palatino Linotype" w:cs="Palatino Linotype"/>
               </w:rPr>
-              <w:t>3.735</w:t>
+              <w:t>3.793</w:t>
             </w:r>
           </w:p>
         </w:tc>
@@ -5787,7 +5787,7 @@
                 <w:sz w:val="18"/>
                 <w:rFonts w:ascii="Palatino Linotype" w:hAnsi="Palatino Linotype" w:cs="Palatino Linotype"/>
               </w:rPr>
-              <w:t>1.057</w:t>
+              <w:t>1.069</w:t>
             </w:r>
           </w:p>
         </w:tc>
@@ -5851,7 +5851,7 @@
                 <w:sz w:val="18"/>
                 <w:rFonts w:ascii="Palatino Linotype" w:hAnsi="Palatino Linotype" w:cs="Palatino Linotype"/>
               </w:rPr>
-              <w:t>6.292</w:t>
+              <w:t>6.371</w:t>
             </w:r>
           </w:p>
         </w:tc>
@@ -5915,7 +5915,7 @@
                 <w:sz w:val="18"/>
                 <w:rFonts w:ascii="Palatino Linotype" w:hAnsi="Palatino Linotype" w:cs="Palatino Linotype"/>
               </w:rPr>
-              <w:t>1.849</w:t>
+              <w:t>1.927</w:t>
             </w:r>
           </w:p>
         </w:tc>
@@ -5979,7 +5979,7 @@
                 <w:sz w:val="18"/>
                 <w:rFonts w:ascii="Palatino Linotype" w:hAnsi="Palatino Linotype" w:cs="Palatino Linotype"/>
               </w:rPr>
-              <w:t>32.372</w:t>
+              <w:t>32.379</w:t>
             </w:r>
           </w:p>
         </w:tc>
@@ -6043,7 +6043,7 @@
                 <w:sz w:val="18"/>
                 <w:rFonts w:ascii="Palatino Linotype" w:hAnsi="Palatino Linotype" w:cs="Palatino Linotype"/>
               </w:rPr>
-              <w:t>3.417</w:t>
+              <w:t>3.434</w:t>
             </w:r>
           </w:p>
         </w:tc>
@@ -6107,7 +6107,7 @@
                 <w:sz w:val="18"/>
                 <w:rFonts w:ascii="Palatino Linotype" w:hAnsi="Palatino Linotype" w:cs="Palatino Linotype"/>
               </w:rPr>
-              <w:t>5.916</w:t>
+              <w:t>5.928</w:t>
             </w:r>
           </w:p>
         </w:tc>
@@ -6171,7 +6171,7 @@
                 <w:sz w:val="18"/>
                 <w:rFonts w:ascii="Palatino Linotype" w:hAnsi="Palatino Linotype" w:cs="Palatino Linotype"/>
               </w:rPr>
-              <w:t>54.858</w:t>
+              <w:t>55.121</w:t>
             </w:r>
           </w:p>
         </w:tc>
@@ -6666,7 +6666,7 @@
           <w:sz w:val="21"/>
           <w:rFonts w:ascii="Palatino Linotype" w:hAnsi="Palatino Linotype" w:cs="Palatino Linotype"/>
         </w:rPr>
-        <w:t>El contenido curricular de la obra son 32.372 líneas de JSON de diseño propio, con su esquema normativo y su validador. Lo que sigue describe las estructuras originales que lo sostienen.</w:t>
+        <w:t>El contenido curricular de la obra son 32.379 líneas de JSON de diseño propio, con su esquema normativo y su validador. Lo que sigue describe las estructuras originales que lo sostienen.</w:t>
       </w:r>
     </w:p>
     <w:p>
@@ -7644,7 +7644,7 @@
                 <w:sz w:val="18"/>
                 <w:rFonts w:ascii="Palatino Linotype" w:hAnsi="Palatino Linotype" w:cs="Palatino Linotype"/>
               </w:rPr>
-              <w:t>0.4.0</w:t>
+              <w:t>0.5.0</w:t>
             </w:r>
           </w:p>
         </w:tc>
@@ -13498,7 +13498,7 @@
                 <w:sz w:val="18"/>
                 <w:rFonts w:ascii="Palatino Linotype" w:hAnsi="Palatino Linotype" w:cs="Palatino Linotype"/>
               </w:rPr>
-              <w:t>3.735 líneas de JavaScript en módulos ES nativos, más 220 de HTML e instalación y 1.057 de estilos de pantalla e impresión.</w:t>
+              <w:t>3.793 líneas de JavaScript en módulos ES nativos, más 220 de HTML e instalación y 1.069 de estilos de pantalla e impresión.</w:t>
             </w:r>
           </w:p>
         </w:tc>
@@ -13540,7 +13540,7 @@
                 <w:sz w:val="18"/>
                 <w:rFonts w:ascii="Palatino Linotype" w:hAnsi="Palatino Linotype" w:cs="Palatino Linotype"/>
               </w:rPr>
-              <w:t>6.292 líneas de Python: validadores, generadores de derivados, verificador de derivación normativa, simulador de corrección y lector de contexto.</w:t>
+              <w:t>6.371 líneas de Python: validadores, generadores de derivados, verificador de derivación normativa, simulador de corrección y lector de contexto.</w:t>
             </w:r>
           </w:p>
         </w:tc>
@@ -13582,7 +13582,7 @@
                 <w:sz w:val="18"/>
                 <w:rFonts w:ascii="Palatino Linotype" w:hAnsi="Palatino Linotype" w:cs="Palatino Linotype"/>
               </w:rPr>
-              <w:t>1.849 líneas de casos dorados en Node, sin dependencias: validador regla a regla, premarcado y puertas, proyección a primera persona y modelo de calificación.</w:t>
+              <w:t>1.927 líneas de casos dorados en Node, sin dependencias: validador regla a regla, premarcado y puertas, proyección a primera persona y modelo de calificación.</w:t>
             </w:r>
           </w:p>
         </w:tc>
@@ -13624,7 +13624,7 @@
                 <w:sz w:val="18"/>
                 <w:rFonts w:ascii="Palatino Linotype" w:hAnsi="Palatino Linotype" w:cs="Palatino Linotype"/>
               </w:rPr>
-              <w:t>32.372 líneas de JSON: diez packs de criterios, catálogo, tablas de derivación, léxico de reglas, banco de verbos y esquema.</w:t>
+              <w:t>32.379 líneas de JSON: diez packs de criterios, catálogo, tablas de derivación, léxico de reglas, banco de verbos y esquema.</w:t>
             </w:r>
           </w:p>
         </w:tc>
@@ -13666,7 +13666,7 @@
                 <w:sz w:val="18"/>
                 <w:rFonts w:ascii="Palatino Linotype" w:hAnsi="Palatino Linotype" w:cs="Palatino Linotype"/>
               </w:rPr>
-              <w:t>3.417 líneas: documento de diseño de software, registro razonado de cambios, motivos de cada regla, guía para añadir una materia y análisis de enlace con los proyectos afines del autor.</w:t>
+              <w:t>3.434 líneas: documento de diseño de software, registro razonado de cambios, motivos de cada regla, guía para añadir una materia y análisis de enlace con los proyectos afines del autor.</w:t>
             </w:r>
           </w:p>
         </w:tc>

</xml_diff>

<commit_message>
Calificar en cuadrícula, al modo de iDoceo (v1.54)
La pantalla era una columna de tarjetas con desplegables y la nota al
final; ahora es la tabla de la rúbrica con las celdas de descriptor
pinchables y la nota fija arriba, recalculada a cada clic. En las
dimensiones con matriz, «Contar» despliega las bandas dentro de la fila.

- js/calificacion.js: estado de fila ⇄ ResultadoCriterio como funciones
  puras (estadoFilaVacio, resultadoDeFila, estadoDeResultado), 7 casos.
- js/calificar.js: cuadrícula, barra pegajosa, «Guardar y pasar al
  siguiente». Formato guardado sin cambios.
- css: estilos de la cuadrícula; la tarjeta de Calificar/Ajustar ya no
  lleva margin auto dentro de la columna flex (desbordaba en móvil).
- SDD §6.5: un criterio con matriz produce nivel o matriz según lo que
  haga el docente. Registro v1.54, microexplicaciones, guía y memoria.

Co-Authored-By: Claude Opus 5 <noreply@anthropic.com>
</commit_message>
<xml_diff>
--- a/docs/Memoria_Registro_PI_Taller-de-Rubricas.docx
+++ b/docs/Memoria_Registro_PI_Taller-de-Rubricas.docx
@@ -859,7 +859,7 @@
                 <w:sz w:val="18"/>
                 <w:rFonts w:ascii="Palatino Linotype" w:hAnsi="Palatino Linotype" w:cs="Palatino Linotype"/>
               </w:rPr>
-              <w:t>13.662 líneas de código fuente propio y 32.386 líneas de contenido curricular estructurado</w:t>
+              <w:t>14.048 líneas de código fuente propio y 32.386 líneas de contenido curricular estructurado</w:t>
             </w:r>
           </w:p>
         </w:tc>
@@ -4035,7 +4035,7 @@
           <w:sz w:val="21"/>
           <w:rFonts w:ascii="Palatino Linotype" w:hAnsi="Palatino Linotype" w:cs="Palatino Linotype"/>
         </w:rPr>
-        <w:t>El profesor registra el resultado de cada alumno —nivel por dimensión o banda por componente en las dimensiones con matriz— y la aplicación calcula la nota con el modelo de §5.3. El resultado se guarda en el propio navegador, separado por curso, tipo de tarea y actividad, y se puede recargar, corregir y borrar. Al recomponerlo contra el instrumento vigente, una dimensión que el profesor haya desactivado después de calificar se omite en lugar de romper, y la nota se recalcula con lo que queda activo.</w:t>
+        <w:t>El profesor registra el resultado de cada alumno en una cuadrícula —la tabla de la rúbrica con las celdas de descriptor pinchables, un clic por dimensión, o la banda de cada componente en las dimensiones con matriz— y la aplicación calcula la nota con el modelo de §5.3 a cada clic, en una barra fija. El resultado se guarda en el propio navegador, separado por curso, tipo de tarea y actividad, y se puede recargar, corregir y borrar. Al recomponerlo contra el instrumento vigente, una dimensión que el profesor haya desactivado después de calificar se omite en lugar de romper, y la nota se recalcula con lo que queda activo.</w:t>
       </w:r>
     </w:p>
     <w:p>
@@ -4646,7 +4646,7 @@
                 <w:sz w:val="18"/>
                 <w:rFonts w:ascii="Palatino Linotype" w:hAnsi="Palatino Linotype" w:cs="Palatino Linotype"/>
               </w:rPr>
-              <w:t>JavaScript con módulos ES nativos (3.918 líneas): motor de generación, modelo de calificación, validador de calidad, catálogo de microexplicaciones, modo avanzado, pantalla de calificar y exportadores.</w:t>
+              <w:t>JavaScript con módulos ES nativos (4.144 líneas): motor de generación, modelo de calificación, validador de calidad, catálogo de microexplicaciones, modo avanzado, pantalla de calificar y exportadores.</w:t>
             </w:r>
           </w:p>
         </w:tc>
@@ -4730,7 +4730,7 @@
                 <w:sz w:val="18"/>
                 <w:rFonts w:ascii="Palatino Linotype" w:hAnsi="Palatino Linotype" w:cs="Palatino Linotype"/>
               </w:rPr>
-              <w:t>Programas en Python (6.457 líneas) que construyen los derivados, validan el contenido y verifican mecánicamente la derivación normativa. No forman parte de lo que se sirve al navegador, pero sí de la obra.</w:t>
+              <w:t>Programas en Python (6.465 líneas) que construyen los derivados, validan el contenido y verifican mecánicamente la derivación normativa. No forman parte de lo que se sirve al navegador, pero sí de la obra.</w:t>
             </w:r>
           </w:p>
         </w:tc>
@@ -4772,7 +4772,7 @@
                 <w:sz w:val="18"/>
                 <w:rFonts w:ascii="Palatino Linotype" w:hAnsi="Palatino Linotype" w:cs="Palatino Linotype"/>
               </w:rPr>
-              <w:t>Casos dorados en Node sin dependencias (1.998 líneas): validador, premarcado, proyección a primera persona y modelo de calificación.</w:t>
+              <w:t>Casos dorados en Node sin dependencias (2.067 líneas): validador, premarcado, proyección a primera persona y modelo de calificación.</w:t>
             </w:r>
           </w:p>
         </w:tc>
@@ -5659,7 +5659,7 @@
                 <w:sz w:val="18"/>
                 <w:rFonts w:ascii="Palatino Linotype" w:hAnsi="Palatino Linotype" w:cs="Palatino Linotype"/>
               </w:rPr>
-              <w:t>3.918</w:t>
+              <w:t>4.144</w:t>
             </w:r>
           </w:p>
         </w:tc>
@@ -5787,7 +5787,7 @@
                 <w:sz w:val="18"/>
                 <w:rFonts w:ascii="Palatino Linotype" w:hAnsi="Palatino Linotype" w:cs="Palatino Linotype"/>
               </w:rPr>
-              <w:t>1.069</w:t>
+              <w:t>1.152</w:t>
             </w:r>
           </w:p>
         </w:tc>
@@ -5851,7 +5851,7 @@
                 <w:sz w:val="18"/>
                 <w:rFonts w:ascii="Palatino Linotype" w:hAnsi="Palatino Linotype" w:cs="Palatino Linotype"/>
               </w:rPr>
-              <w:t>6.457</w:t>
+              <w:t>6.465</w:t>
             </w:r>
           </w:p>
         </w:tc>
@@ -5915,7 +5915,7 @@
                 <w:sz w:val="18"/>
                 <w:rFonts w:ascii="Palatino Linotype" w:hAnsi="Palatino Linotype" w:cs="Palatino Linotype"/>
               </w:rPr>
-              <w:t>1.998</w:t>
+              <w:t>2.067</w:t>
             </w:r>
           </w:p>
         </w:tc>
@@ -6043,7 +6043,7 @@
                 <w:sz w:val="18"/>
                 <w:rFonts w:ascii="Palatino Linotype" w:hAnsi="Palatino Linotype" w:cs="Palatino Linotype"/>
               </w:rPr>
-              <w:t>3.440</w:t>
+              <w:t>3.475</w:t>
             </w:r>
           </w:p>
         </w:tc>
@@ -6171,7 +6171,7 @@
                 <w:sz w:val="18"/>
                 <w:rFonts w:ascii="Palatino Linotype" w:hAnsi="Palatino Linotype" w:cs="Palatino Linotype"/>
               </w:rPr>
-              <w:t>55.430</w:t>
+              <w:t>55.851</w:t>
             </w:r>
           </w:p>
         </w:tc>
@@ -13498,7 +13498,7 @@
                 <w:sz w:val="18"/>
                 <w:rFonts w:ascii="Palatino Linotype" w:hAnsi="Palatino Linotype" w:cs="Palatino Linotype"/>
               </w:rPr>
-              <w:t>3.918 líneas de JavaScript en módulos ES nativos, más 220 de HTML e instalación y 1.069 de estilos de pantalla e impresión.</w:t>
+              <w:t>4.144 líneas de JavaScript en módulos ES nativos, más 220 de HTML e instalación y 1.152 de estilos de pantalla e impresión.</w:t>
             </w:r>
           </w:p>
         </w:tc>
@@ -13540,7 +13540,7 @@
                 <w:sz w:val="18"/>
                 <w:rFonts w:ascii="Palatino Linotype" w:hAnsi="Palatino Linotype" w:cs="Palatino Linotype"/>
               </w:rPr>
-              <w:t>6.457 líneas de Python: validadores, generadores de derivados, verificador de derivación normativa, simulador de corrección y lector de contexto.</w:t>
+              <w:t>6.465 líneas de Python: validadores, generadores de derivados, verificador de derivación normativa, simulador de corrección y lector de contexto.</w:t>
             </w:r>
           </w:p>
         </w:tc>
@@ -13582,7 +13582,7 @@
                 <w:sz w:val="18"/>
                 <w:rFonts w:ascii="Palatino Linotype" w:hAnsi="Palatino Linotype" w:cs="Palatino Linotype"/>
               </w:rPr>
-              <w:t>1.998 líneas de casos dorados en Node, sin dependencias: validador regla a regla, premarcado y puertas, proyección a primera persona y modelo de calificación.</w:t>
+              <w:t>2.067 líneas de casos dorados en Node, sin dependencias: validador regla a regla, premarcado y puertas, proyección a primera persona y modelo de calificación.</w:t>
             </w:r>
           </w:p>
         </w:tc>
@@ -13666,7 +13666,7 @@
                 <w:sz w:val="18"/>
                 <w:rFonts w:ascii="Palatino Linotype" w:hAnsi="Palatino Linotype" w:cs="Palatino Linotype"/>
               </w:rPr>
-              <w:t>3.440 líneas: documento de diseño de software, registro razonado de cambios, motivos de cada regla, guía para añadir una materia y análisis de enlace con los proyectos afines del autor.</w:t>
+              <w:t>3.475 líneas: documento de diseño de software, registro razonado de cambios, motivos de cada regla, guía para añadir una materia y análisis de enlace con los proyectos afines del autor.</w:t>
             </w:r>
           </w:p>
         </w:tc>

</xml_diff>

<commit_message>
La puerta de aplicabilidad deja de llamar «proyecto» a lo que no tiene por qué serlo (v1.59)
«Tarea de desempeño o proyecto» pasa a «Actividad competencial»: el
nombre sugería un formato -proyecto, producto «real»- que la normativa
no exige, y ni el profesorado ni el alumnado usan ese término. La
explicación de la opción lleva ahora la definición completa, con los
dos registros -producción académica tradicional o creación en un
contexto comunicativo más auténtico- y su ejemplo. El identificador
interno (desempeno) no cambia. Guía docente y memoria de registro
regeneradas.

Co-Authored-By: Claude Sonnet 5 <noreply@anthropic.com>
</commit_message>
<xml_diff>
--- a/docs/Memoria_Registro_PI_Taller-de-Rubricas.docx
+++ b/docs/Memoria_Registro_PI_Taller-de-Rubricas.docx
@@ -859,7 +859,7 @@
                 <w:sz w:val="18"/>
                 <w:rFonts w:ascii="Palatino Linotype" w:hAnsi="Palatino Linotype" w:cs="Palatino Linotype"/>
               </w:rPr>
-              <w:t>14.048 líneas de código fuente propio y 32.386 líneas de contenido curricular estructurado</w:t>
+              <w:t>14.063 líneas de código fuente propio y 32.386 líneas de contenido curricular estructurado</w:t>
             </w:r>
           </w:p>
         </w:tc>
@@ -1975,7 +1975,7 @@
                 <w:sz w:val="18"/>
                 <w:rFonts w:ascii="Palatino Linotype" w:hAnsi="Palatino Linotype" w:cs="Palatino Linotype"/>
               </w:rPr>
-              <w:t>Tarea de desempeño o proyecto</w:t>
+              <w:t>Actividad competencial</w:t>
             </w:r>
           </w:p>
         </w:tc>
@@ -4646,7 +4646,7 @@
                 <w:sz w:val="18"/>
                 <w:rFonts w:ascii="Palatino Linotype" w:hAnsi="Palatino Linotype" w:cs="Palatino Linotype"/>
               </w:rPr>
-              <w:t>JavaScript con módulos ES nativos (4.144 líneas): motor de generación, modelo de calificación, validador de calidad, catálogo de microexplicaciones, modo avanzado, pantalla de calificar y exportadores.</w:t>
+              <w:t>JavaScript con módulos ES nativos (4.153 líneas): motor de generación, modelo de calificación, validador de calidad, catálogo de microexplicaciones, modo avanzado, pantalla de calificar y exportadores.</w:t>
             </w:r>
           </w:p>
         </w:tc>
@@ -5659,7 +5659,7 @@
                 <w:sz w:val="18"/>
                 <w:rFonts w:ascii="Palatino Linotype" w:hAnsi="Palatino Linotype" w:cs="Palatino Linotype"/>
               </w:rPr>
-              <w:t>4.144</w:t>
+              <w:t>4.153</w:t>
             </w:r>
           </w:p>
         </w:tc>
@@ -5723,7 +5723,7 @@
                 <w:sz w:val="18"/>
                 <w:rFonts w:ascii="Palatino Linotype" w:hAnsi="Palatino Linotype" w:cs="Palatino Linotype"/>
               </w:rPr>
-              <w:t>220</w:t>
+              <w:t>226</w:t>
             </w:r>
           </w:p>
         </w:tc>
@@ -6043,7 +6043,7 @@
                 <w:sz w:val="18"/>
                 <w:rFonts w:ascii="Palatino Linotype" w:hAnsi="Palatino Linotype" w:cs="Palatino Linotype"/>
               </w:rPr>
-              <w:t>3.475</w:t>
+              <w:t>3.480</w:t>
             </w:r>
           </w:p>
         </w:tc>
@@ -6171,7 +6171,7 @@
                 <w:sz w:val="18"/>
                 <w:rFonts w:ascii="Palatino Linotype" w:hAnsi="Palatino Linotype" w:cs="Palatino Linotype"/>
               </w:rPr>
-              <w:t>55.851</w:t>
+              <w:t>55.871</w:t>
             </w:r>
           </w:p>
         </w:tc>
@@ -6909,7 +6909,7 @@
                 <w:sz w:val="18"/>
                 <w:rFonts w:ascii="Palatino Linotype" w:hAnsi="Palatino Linotype" w:cs="Palatino Linotype"/>
               </w:rPr>
-              <w:t>0.4.0</w:t>
+              <w:t>0.7.0</w:t>
             </w:r>
           </w:p>
         </w:tc>
@@ -7014,7 +7014,7 @@
                 <w:sz w:val="18"/>
                 <w:rFonts w:ascii="Palatino Linotype" w:hAnsi="Palatino Linotype" w:cs="Palatino Linotype"/>
               </w:rPr>
-              <w:t>0.3.0</w:t>
+              <w:t>0.5.0</w:t>
             </w:r>
           </w:p>
         </w:tc>
@@ -7224,7 +7224,7 @@
                 <w:sz w:val="18"/>
                 <w:rFonts w:ascii="Palatino Linotype" w:hAnsi="Palatino Linotype" w:cs="Palatino Linotype"/>
               </w:rPr>
-              <w:t>0.4.0</w:t>
+              <w:t>0.7.0</w:t>
             </w:r>
           </w:p>
         </w:tc>
@@ -7329,7 +7329,7 @@
                 <w:sz w:val="18"/>
                 <w:rFonts w:ascii="Palatino Linotype" w:hAnsi="Palatino Linotype" w:cs="Palatino Linotype"/>
               </w:rPr>
-              <w:t>0.5.0</w:t>
+              <w:t>0.7.0</w:t>
             </w:r>
           </w:p>
         </w:tc>
@@ -7644,7 +7644,7 @@
                 <w:sz w:val="18"/>
                 <w:rFonts w:ascii="Palatino Linotype" w:hAnsi="Palatino Linotype" w:cs="Palatino Linotype"/>
               </w:rPr>
-              <w:t>0.7.0</w:t>
+              <w:t>0.8.0</w:t>
             </w:r>
           </w:p>
         </w:tc>
@@ -7749,7 +7749,7 @@
                 <w:sz w:val="18"/>
                 <w:rFonts w:ascii="Palatino Linotype" w:hAnsi="Palatino Linotype" w:cs="Palatino Linotype"/>
               </w:rPr>
-              <w:t>0.3.0</w:t>
+              <w:t>0.4.0</w:t>
             </w:r>
           </w:p>
         </w:tc>
@@ -7854,7 +7854,7 @@
                 <w:sz w:val="18"/>
                 <w:rFonts w:ascii="Palatino Linotype" w:hAnsi="Palatino Linotype" w:cs="Palatino Linotype"/>
               </w:rPr>
-              <w:t>0.3.0</w:t>
+              <w:t>0.4.0</w:t>
             </w:r>
           </w:p>
         </w:tc>
@@ -13498,7 +13498,7 @@
                 <w:sz w:val="18"/>
                 <w:rFonts w:ascii="Palatino Linotype" w:hAnsi="Palatino Linotype" w:cs="Palatino Linotype"/>
               </w:rPr>
-              <w:t>4.144 líneas de JavaScript en módulos ES nativos, más 220 de HTML e instalación y 1.152 de estilos de pantalla e impresión.</w:t>
+              <w:t>4.153 líneas de JavaScript en módulos ES nativos, más 226 de HTML e instalación y 1.152 de estilos de pantalla e impresión.</w:t>
             </w:r>
           </w:p>
         </w:tc>
@@ -13666,7 +13666,7 @@
                 <w:sz w:val="18"/>
                 <w:rFonts w:ascii="Palatino Linotype" w:hAnsi="Palatino Linotype" w:cs="Palatino Linotype"/>
               </w:rPr>
-              <w:t>3.475 líneas: documento de diseño de software, registro razonado de cambios, motivos de cada regla, guía para añadir una materia y análisis de enlace con los proyectos afines del autor.</w:t>
+              <w:t>3.480 líneas: documento de diseño de software, registro razonado de cambios, motivos de cada regla, guía para añadir una materia y análisis de enlace con los proyectos afines del autor.</w:t>
             </w:r>
           </w:p>
         </w:tc>

</xml_diff>